<commit_message>
Worked on multiple merge updates for Azure.
</commit_message>
<xml_diff>
--- a/project/documents/communications/MissingPartsXmit2.docx
+++ b/project/documents/communications/MissingPartsXmit2.docx
@@ -28,14 +28,9 @@
           <w:sz w:val="24"/>
           <w:u w:val="single"/>
         </w:rPr>
-        <w:t>&lt;&lt;serialNo&gt;&gt;</w:t>
-      </w:r>
-      <w:r>
-        <w:rPr>
-          <w:sz w:val="24"/>
-        </w:rPr>
-        <w:tab/>
-      </w:r>
+        <w:t>&lt;&lt;</w:t>
+      </w:r>
+      <w:proofErr w:type="spellStart"/>
       <w:r>
         <w:rPr>
           <w:b/>
@@ -43,25 +38,9 @@
           <w:sz w:val="24"/>
           <w:u w:val="single"/>
         </w:rPr>
-        <w:t>PATENT</w:t>
-      </w:r>
-    </w:p>
-    <w:p>
-      <w:pPr>
-        <w:tabs>
-          <w:tab w:val="center" w:pos="4680"/>
-        </w:tabs>
-        <w:spacing w:line="300" w:lineRule="auto"/>
-        <w:rPr>
-          <w:sz w:val="24"/>
-        </w:rPr>
-      </w:pPr>
-      <w:r>
-        <w:rPr>
-          <w:sz w:val="24"/>
-        </w:rPr>
-        <w:tab/>
-      </w:r>
+        <w:t>serialNo</w:t>
+      </w:r>
+      <w:proofErr w:type="spellEnd"/>
       <w:r>
         <w:rPr>
           <w:b/>
@@ -69,6 +48,47 @@
           <w:sz w:val="24"/>
           <w:u w:val="single"/>
         </w:rPr>
+        <w:t>&gt;&gt;</w:t>
+      </w:r>
+      <w:r>
+        <w:rPr>
+          <w:sz w:val="24"/>
+        </w:rPr>
+        <w:tab/>
+      </w:r>
+      <w:r>
+        <w:rPr>
+          <w:b/>
+          <w:bCs/>
+          <w:sz w:val="24"/>
+          <w:u w:val="single"/>
+        </w:rPr>
+        <w:t>PATENT</w:t>
+      </w:r>
+    </w:p>
+    <w:p>
+      <w:pPr>
+        <w:tabs>
+          <w:tab w:val="center" w:pos="4680"/>
+        </w:tabs>
+        <w:spacing w:line="300" w:lineRule="auto"/>
+        <w:rPr>
+          <w:sz w:val="24"/>
+        </w:rPr>
+      </w:pPr>
+      <w:r>
+        <w:rPr>
+          <w:sz w:val="24"/>
+        </w:rPr>
+        <w:tab/>
+      </w:r>
+      <w:r>
+        <w:rPr>
+          <w:b/>
+          <w:bCs/>
+          <w:sz w:val="24"/>
+          <w:u w:val="single"/>
+        </w:rPr>
         <w:t>IN THE UNITED STATES PATENT AND TRADEMARK OFFICE</w:t>
       </w:r>
     </w:p>
@@ -87,7 +107,21 @@
         <w:rPr>
           <w:sz w:val="24"/>
         </w:rPr>
-        <w:t>Inventor(s):     &lt;&lt;inventorEtal&gt;&gt;</w:t>
+        <w:t>Inventor(s):     &lt;&lt;</w:t>
+      </w:r>
+      <w:proofErr w:type="spellStart"/>
+      <w:r>
+        <w:rPr>
+          <w:sz w:val="24"/>
+        </w:rPr>
+        <w:t>inventorEtal</w:t>
+      </w:r>
+      <w:proofErr w:type="spellEnd"/>
+      <w:r>
+        <w:rPr>
+          <w:sz w:val="24"/>
+        </w:rPr>
+        <w:t>&gt;&gt;</w:t>
       </w:r>
       <w:r>
         <w:rPr>
@@ -106,7 +140,21 @@
         <w:rPr>
           <w:sz w:val="24"/>
         </w:rPr>
-        <w:t>&lt;&lt;examinerName&gt;&gt;</w:t>
+        <w:t>&lt;&lt;</w:t>
+      </w:r>
+      <w:proofErr w:type="spellStart"/>
+      <w:r>
+        <w:rPr>
+          <w:sz w:val="24"/>
+        </w:rPr>
+        <w:t>examinerName</w:t>
+      </w:r>
+      <w:proofErr w:type="spellEnd"/>
+      <w:r>
+        <w:rPr>
+          <w:sz w:val="24"/>
+        </w:rPr>
+        <w:t>&gt;&gt;</w:t>
       </w:r>
     </w:p>
     <w:p>
@@ -136,7 +184,21 @@
         <w:rPr>
           <w:sz w:val="24"/>
         </w:rPr>
-        <w:t>&lt;&lt;serialNo&gt;&gt;</w:t>
+        <w:t>&lt;&lt;</w:t>
+      </w:r>
+      <w:proofErr w:type="spellStart"/>
+      <w:r>
+        <w:rPr>
+          <w:sz w:val="24"/>
+        </w:rPr>
+        <w:t>serialNo</w:t>
+      </w:r>
+      <w:proofErr w:type="spellEnd"/>
+      <w:r>
+        <w:rPr>
+          <w:sz w:val="24"/>
+        </w:rPr>
+        <w:t>&gt;&gt;</w:t>
       </w:r>
       <w:r>
         <w:rPr>
@@ -149,7 +211,21 @@
         <w:rPr>
           <w:sz w:val="24"/>
         </w:rPr>
-        <w:t>&lt;&lt;artUnit&gt;&gt;</w:t>
+        <w:t>&lt;&lt;</w:t>
+      </w:r>
+      <w:proofErr w:type="spellStart"/>
+      <w:r>
+        <w:rPr>
+          <w:sz w:val="24"/>
+        </w:rPr>
+        <w:t>artUnit</w:t>
+      </w:r>
+      <w:proofErr w:type="spellEnd"/>
+      <w:r>
+        <w:rPr>
+          <w:sz w:val="24"/>
+        </w:rPr>
+        <w:t>&gt;&gt;</w:t>
       </w:r>
     </w:p>
     <w:p>
@@ -179,7 +255,21 @@
         <w:rPr>
           <w:sz w:val="24"/>
         </w:rPr>
-        <w:t>&lt;&lt;filedDate&gt;&gt;</w:t>
+        <w:t>&lt;&lt;</w:t>
+      </w:r>
+      <w:proofErr w:type="spellStart"/>
+      <w:r>
+        <w:rPr>
+          <w:sz w:val="24"/>
+        </w:rPr>
+        <w:t>filedDate</w:t>
+      </w:r>
+      <w:proofErr w:type="spellEnd"/>
+      <w:r>
+        <w:rPr>
+          <w:sz w:val="24"/>
+        </w:rPr>
+        <w:t>&gt;&gt;</w:t>
       </w:r>
       <w:r>
         <w:rPr>
@@ -192,7 +282,21 @@
         <w:rPr>
           <w:sz w:val="24"/>
         </w:rPr>
-        <w:t>&lt;&lt;matterNo&gt;&gt;</w:t>
+        <w:t>&lt;&lt;</w:t>
+      </w:r>
+      <w:proofErr w:type="spellStart"/>
+      <w:r>
+        <w:rPr>
+          <w:sz w:val="24"/>
+        </w:rPr>
+        <w:t>matterNo</w:t>
+      </w:r>
+      <w:proofErr w:type="spellEnd"/>
+      <w:r>
+        <w:rPr>
+          <w:sz w:val="24"/>
+        </w:rPr>
+        <w:t>&gt;&gt;</w:t>
       </w:r>
     </w:p>
     <w:p>
@@ -209,14 +313,30 @@
         <w:t xml:space="preserve">Customer No.: </w:t>
       </w:r>
       <w:r>
-        <w:t>&lt;&lt;custNoCorresp&gt;&gt;</w:t>
+        <w:t>&lt;&lt;</w:t>
+      </w:r>
+      <w:proofErr w:type="spellStart"/>
+      <w:r>
+        <w:t>custNoCorresp</w:t>
+      </w:r>
+      <w:proofErr w:type="spellEnd"/>
+      <w:r>
+        <w:t>&gt;&gt;</w:t>
       </w:r>
       <w:r>
         <w:tab/>
         <w:t xml:space="preserve">Confirmation No.: </w:t>
       </w:r>
       <w:r>
-        <w:t>&lt;&lt;confirmNo&gt;&gt;</w:t>
+        <w:t>&lt;&lt;</w:t>
+      </w:r>
+      <w:proofErr w:type="spellStart"/>
+      <w:r>
+        <w:t>confirmNo</w:t>
+      </w:r>
+      <w:proofErr w:type="spellEnd"/>
+      <w:r>
+        <w:t>&gt;&gt;</w:t>
       </w:r>
     </w:p>
     <w:p>
@@ -828,7 +948,21 @@
         <w:rPr>
           <w:sz w:val="24"/>
         </w:rPr>
-        <w:t>&lt;&lt;signatureDate&gt;&gt;</w:t>
+        <w:t>&lt;&lt;</w:t>
+      </w:r>
+      <w:proofErr w:type="spellStart"/>
+      <w:r>
+        <w:rPr>
+          <w:sz w:val="24"/>
+        </w:rPr>
+        <w:t>signatureDate</w:t>
+      </w:r>
+      <w:proofErr w:type="spellEnd"/>
+      <w:r>
+        <w:rPr>
+          <w:sz w:val="24"/>
+        </w:rPr>
+        <w:t>&gt;&gt;</w:t>
       </w:r>
       <w:r>
         <w:rPr>
@@ -852,7 +986,21 @@
         <w:rPr>
           <w:sz w:val="24"/>
         </w:rPr>
-        <w:t>&lt;&lt;echoSignature&gt;&gt;</w:t>
+        <w:t>&lt;&lt;</w:t>
+      </w:r>
+      <w:proofErr w:type="spellStart"/>
+      <w:r>
+        <w:rPr>
+          <w:sz w:val="24"/>
+        </w:rPr>
+        <w:t>echoSignature</w:t>
+      </w:r>
+      <w:proofErr w:type="spellEnd"/>
+      <w:r>
+        <w:rPr>
+          <w:sz w:val="24"/>
+        </w:rPr>
+        <w:t>&gt;&gt;</w:t>
       </w:r>
     </w:p>
     <w:p>
@@ -918,30 +1066,6 @@
       </w:pPr>
       <w:r>
         <w:rPr>
-          <w:rFonts w:cs="Dutch801 Rm BT"/>
-          <w:sz w:val="18"/>
-          <w:szCs w:val="18"/>
-        </w:rPr>
-        <w:t>&lt;&lt;nickSA&gt;&gt;</w:t>
-      </w:r>
-      <w:r>
-        <w:rPr>
-          <w:rFonts w:cs="Dutch801 Rm BT"/>
-          <w:sz w:val="18"/>
-          <w:szCs w:val="18"/>
-        </w:rPr>
-        <w:t>:CMG:</w:t>
-      </w:r>
-      <w:r>
-        <w:rPr>
-          <w:rFonts w:cs="Dutch801 Rm BT"/>
-          <w:sz w:val="18"/>
-          <w:szCs w:val="18"/>
-        </w:rPr>
-        <w:t>&lt;&lt;nickU&gt;&gt;</w:t>
-      </w:r>
-      <w:r>
-        <w:rPr>
           <w:sz w:val="24"/>
         </w:rPr>
         <w:tab/>
@@ -957,7 +1081,21 @@
         <w:rPr>
           <w:sz w:val="24"/>
         </w:rPr>
-        <w:t>&lt;&lt;SARegNo&gt;&gt;</w:t>
+        <w:t>&lt;&lt;</w:t>
+      </w:r>
+      <w:proofErr w:type="spellStart"/>
+      <w:r>
+        <w:rPr>
+          <w:sz w:val="24"/>
+        </w:rPr>
+        <w:t>SARegNo</w:t>
+      </w:r>
+      <w:proofErr w:type="spellEnd"/>
+      <w:r>
+        <w:rPr>
+          <w:sz w:val="24"/>
+        </w:rPr>
+        <w:t>&gt;&gt;</w:t>
       </w:r>
     </w:p>
     <w:p>

</xml_diff>